<commit_message>
Complete China object analysis section in project document
Agent-Logs-Url: https://github.com/yfhvdhbcf/AS/sessions/65215588-90ab-4393-9da8-ebe21df5acac

Co-authored-by: yfhvdhbcf <245815283+yfhvdhbcf@users.noreply.github.com>
</commit_message>
<xml_diff>
--- a/tea group project(1).docx
+++ b/tea group project(1).docx
@@ -1,6 +1,6 @@
 
 <file path=word/document.xml><?xml version="1.0" encoding="utf-8"?>
-<w:document xmlns:wpc="http://schemas.microsoft.com/office/word/2010/wordprocessingCanvas" xmlns:cx="http://schemas.microsoft.com/office/drawing/2014/chartex" xmlns:cx1="http://schemas.microsoft.com/office/drawing/2015/9/8/chartex" xmlns:cx2="http://schemas.microsoft.com/office/drawing/2015/10/21/chartex" xmlns:cx3="http://schemas.microsoft.com/office/drawing/2016/5/9/chartex" xmlns:cx4="http://schemas.microsoft.com/office/drawing/2016/5/10/chartex" xmlns:cx5="http://schemas.microsoft.com/office/drawing/2016/5/11/chartex" xmlns:cx6="http://schemas.microsoft.com/office/drawing/2016/5/12/chartex" xmlns:cx7="http://schemas.microsoft.com/office/drawing/2016/5/13/chartex" xmlns:cx8="http://schemas.microsoft.com/office/drawing/2016/5/14/chartex" xmlns:mc="http://schemas.openxmlformats.org/markup-compatibility/2006" xmlns:aink="http://schemas.microsoft.com/office/drawing/2016/ink" xmlns:am3d="http://schemas.microsoft.com/office/drawing/2017/model3d" xmlns:o="urn:schemas-microsoft-com:office:office" xmlns:oel="http://schemas.microsoft.com/office/2019/extlst" xmlns:r="http://schemas.openxmlformats.org/officeDocument/2006/relationships" xmlns:m="http://schemas.openxmlformats.org/officeDocument/2006/math" xmlns:v="urn:schemas-microsoft-com:vml" xmlns:wp14="http://schemas.microsoft.com/office/word/2010/wordprocessingDrawing" xmlns:wp="http://schemas.openxmlformats.org/drawingml/2006/wordprocessingDrawing" xmlns:w10="urn:schemas-microsoft-com:office:word" xmlns:w="http://schemas.openxmlformats.org/wordprocessingml/2006/main" xmlns:w14="http://schemas.microsoft.com/office/word/2010/wordml" xmlns:w15="http://schemas.microsoft.com/office/word/2012/wordml" xmlns:w16cex="http://schemas.microsoft.com/office/word/2018/wordml/cex" xmlns:w16cid="http://schemas.microsoft.com/office/word/2016/wordml/cid" xmlns:w16="http://schemas.microsoft.com/office/word/2018/wordml" xmlns:w16du="http://schemas.microsoft.com/office/word/2023/wordml/word16du" xmlns:w16sdtdh="http://schemas.microsoft.com/office/word/2020/wordml/sdtdatahash" xmlns:w16sdtfl="http://schemas.microsoft.com/office/word/2024/wordml/sdtformatlock" xmlns:w16se="http://schemas.microsoft.com/office/word/2015/wordml/symex" xmlns:wpg="http://schemas.microsoft.com/office/word/2010/wordprocessingGroup" xmlns:wpi="http://schemas.microsoft.com/office/word/2010/wordprocessingInk" xmlns:wne="http://schemas.microsoft.com/office/word/2006/wordml" xmlns:wps="http://schemas.microsoft.com/office/word/2010/wordprocessingShape" mc:Ignorable="w14 w15 w16se w16cid w16 w16cex w16sdtdh w16sdtfl w16du wp14">
+<w:document xmlns:mc="http://schemas.openxmlformats.org/markup-compatibility/2006" xmlns:r="http://schemas.openxmlformats.org/officeDocument/2006/relationships" xmlns:w="http://schemas.openxmlformats.org/wordprocessingml/2006/main" xmlns:w14="http://schemas.microsoft.com/office/word/2010/wordml" mc:Ignorable="w14 w15 w16se w16cid w16 w16cex w16sdtdh w16sdtfl w16du wp14">
   <w:body>
     <w:p>
       <w:pPr>
@@ -1227,7 +1227,7 @@
         <w:ind w:hanging="234"/>
       </w:pPr>
       <w:r>
-        <w:t>Describe the armor and its materials.</w:t>
+        <w:t>The Ming brigandine armor was made from cloth or leather lined with small iron and steel plates, creating strong protection while allowing soldiers to move quickly in long campaigns.</w:t>
       </w:r>
     </w:p>
     <w:p>
@@ -1239,7 +1239,7 @@
         <w:ind w:hanging="234"/>
       </w:pPr>
       <w:r>
-        <w:t>Explain Ming military organization.</w:t>
+        <w:t>Its design reflects the Ming state's centralized military system, in which standardized equipment supported large garrisons, border defense, and coordinated command under imperial authority.</w:t>
       </w:r>
     </w:p>
     <w:p>
@@ -1251,7 +1251,7 @@
         <w:ind w:hanging="234"/>
       </w:pPr>
       <w:r>
-        <w:t>Discuss practicality and centralized warfare.</w:t>
+        <w:t>Unlike ceremonial armor, this object emphasizes practical battlefield use and reveals how Confucian governance and bureaucracy shaped warfare as a tool for stability and state order.</w:t>
       </w:r>
     </w:p>
     <w:p>
@@ -1264,7 +1264,7 @@
         <w:ind w:hanging="234"/>
       </w:pPr>
       <w:r>
-        <w:t>Compare with Japanese samurai armor.</w:t>
+        <w:t>Compared with Edo samurai armor, which highlighted individual status and warrior identity, Ming armor prioritized uniformity, function, and collective discipline in service of the empire.</w:t>
       </w:r>
     </w:p>
     <w:p>

</xml_diff>

<commit_message>
Complete China weapons section in project document
Agent-Logs-Url: https://github.com/yfhvdhbcf/AS/sessions/b9593ee8-e1d1-4497-8cb5-a6ccea22a3d4

Co-authored-by: yfhvdhbcf <245815283+yfhvdhbcf@users.noreply.github.com>
</commit_message>
<xml_diff>
--- a/tea group project(1).docx
+++ b/tea group project(1).docx
@@ -1,8 +1,8 @@
 
 <file path=word/document.xml><?xml version="1.0" encoding="utf-8"?>
-<w:document xmlns:wpc="http://schemas.microsoft.com/office/word/2010/wordprocessingCanvas" xmlns:cx="http://schemas.microsoft.com/office/drawing/2014/chartex" xmlns:cx1="http://schemas.microsoft.com/office/drawing/2015/9/8/chartex" xmlns:cx2="http://schemas.microsoft.com/office/drawing/2015/10/21/chartex" xmlns:cx3="http://schemas.microsoft.com/office/drawing/2016/5/9/chartex" xmlns:cx4="http://schemas.microsoft.com/office/drawing/2016/5/10/chartex" xmlns:cx5="http://schemas.microsoft.com/office/drawing/2016/5/11/chartex" xmlns:cx6="http://schemas.microsoft.com/office/drawing/2016/5/12/chartex" xmlns:cx7="http://schemas.microsoft.com/office/drawing/2016/5/13/chartex" xmlns:cx8="http://schemas.microsoft.com/office/drawing/2016/5/14/chartex" xmlns:mc="http://schemas.openxmlformats.org/markup-compatibility/2006" xmlns:aink="http://schemas.microsoft.com/office/drawing/2016/ink" xmlns:am3d="http://schemas.microsoft.com/office/drawing/2017/model3d" xmlns:o="urn:schemas-microsoft-com:office:office" xmlns:oel="http://schemas.microsoft.com/office/2019/extlst" xmlns:r="http://schemas.openxmlformats.org/officeDocument/2006/relationships" xmlns:m="http://schemas.openxmlformats.org/officeDocument/2006/math" xmlns:v="urn:schemas-microsoft-com:vml" xmlns:wp14="http://schemas.microsoft.com/office/word/2010/wordprocessingDrawing" xmlns:wp="http://schemas.openxmlformats.org/drawingml/2006/wordprocessingDrawing" xmlns:w10="urn:schemas-microsoft-com:office:word" xmlns:w="http://schemas.openxmlformats.org/wordprocessingml/2006/main" xmlns:w14="http://schemas.microsoft.com/office/word/2010/wordml" xmlns:w15="http://schemas.microsoft.com/office/word/2012/wordml" xmlns:w16cex="http://schemas.microsoft.com/office/word/2018/wordml/cex" xmlns:w16cid="http://schemas.microsoft.com/office/word/2016/wordml/cid" xmlns:w16="http://schemas.microsoft.com/office/word/2018/wordml" xmlns:w16du="http://schemas.microsoft.com/office/word/2023/wordml/word16du" xmlns:w16sdtdh="http://schemas.microsoft.com/office/word/2020/wordml/sdtdatahash" xmlns:w16sdtfl="http://schemas.microsoft.com/office/word/2024/wordml/sdtformatlock" xmlns:w16se="http://schemas.microsoft.com/office/word/2015/wordml/symex" xmlns:wpg="http://schemas.microsoft.com/office/word/2010/wordprocessingGroup" xmlns:wpi="http://schemas.microsoft.com/office/word/2010/wordprocessingInk" xmlns:wne="http://schemas.microsoft.com/office/word/2006/wordml" xmlns:wps="http://schemas.microsoft.com/office/word/2010/wordprocessingShape" mc:Ignorable="w14 w15 w16se w16cid w16 w16cex w16sdtdh w16sdtfl w16du wp14">
+<w:document xmlns:ns1="http://schemas.openxmlformats.org/markup-compatibility/2006" xmlns:ns2="http://schemas.microsoft.com/office/word/2010/wordml" xmlns:r="http://schemas.openxmlformats.org/officeDocument/2006/relationships" xmlns:w="http://schemas.openxmlformats.org/wordprocessingml/2006/main" ns1:Ignorable="w14 w15 w16se w16cid w16 w16cex w16sdtdh w16sdtfl w16du wp14">
   <w:body>
-    <w:p>
+    <w:p ns2:paraId="13EA53B8" ns2:textId="77777777">
       <w:pPr>
         <w:spacing w:after="71" w:line="259" w:lineRule="auto"/>
         <w:jc w:val="center"/>
@@ -15,7 +15,7 @@
         <w:t>Traditional East Asia Group Project</w:t>
       </w:r>
     </w:p>
-    <w:p>
+    <w:p ns2:paraId="1F9A7F14" ns2:textId="77777777">
       <w:pPr>
         <w:spacing w:after="71" w:line="259" w:lineRule="auto"/>
         <w:jc w:val="center"/>
@@ -28,7 +28,7 @@
         <w:t>Outline</w:t>
       </w:r>
     </w:p>
-    <w:p>
+    <w:p ns2:paraId="0509F5D1" ns2:textId="77777777">
       <w:pPr>
         <w:spacing w:after="1400" w:line="259" w:lineRule="auto"/>
         <w:ind w:left="0" w:firstLine="0"/>
@@ -41,7 +41,7 @@
         <w:t>Theme 7: The War Object</w:t>
       </w:r>
     </w:p>
-    <w:p>
+    <w:p ns2:paraId="6A27F457" ns2:textId="77777777">
       <w:pPr>
         <w:pStyle w:val="1"/>
         <w:ind w:left="-5"/>
@@ -50,7 +50,7 @@
         <w:t>Panel Title</w:t>
       </w:r>
     </w:p>
-    <w:p>
+    <w:p ns2:paraId="19D5AE43" ns2:textId="77777777">
       <w:pPr>
         <w:spacing w:after="42" w:line="259" w:lineRule="auto"/>
         <w:ind w:left="-5"/>
@@ -63,7 +63,7 @@
         <w:t>War and Identity in Traditional East Asia:</w:t>
       </w:r>
     </w:p>
-    <w:p>
+    <w:p ns2:paraId="358AEF19" ns2:textId="77777777">
       <w:pPr>
         <w:spacing w:after="859"/>
       </w:pPr>
@@ -71,7 +71,7 @@
         <w:t>Armor, Memory, and Military Culture Across China, Korea, and Japan</w:t>
       </w:r>
     </w:p>
-    <w:p>
+    <w:p ns2:paraId="2E0352BF" ns2:textId="77777777">
       <w:pPr>
         <w:pStyle w:val="1"/>
         <w:ind w:left="-5"/>
@@ -80,7 +80,7 @@
         <w:t>Central Argument</w:t>
       </w:r>
     </w:p>
-    <w:p>
+    <w:p ns2:paraId="508A39DC" ns2:textId="77777777">
       <w:pPr>
         <w:spacing w:after="853"/>
       </w:pPr>
@@ -88,7 +88,7 @@
         <w:t>Although China, Korea, and Japan shared military technologies and interacted through war, each civilization developed a distinct understanding of warfare and martial identity shaped by its political structure, geography, and cultural values.</w:t>
       </w:r>
     </w:p>
-    <w:p>
+    <w:p ns2:paraId="61DA89E8" ns2:textId="77777777">
       <w:pPr>
         <w:pStyle w:val="1"/>
         <w:ind w:left="-5"/>
@@ -116,7 +116,7 @@
         <w:gridCol w:w="2515"/>
         <w:gridCol w:w="2515"/>
       </w:tblGrid>
-      <w:tr>
+      <w:tr ns2:paraId="6BF8A557" ns2:textId="77777777">
         <w:trPr>
           <w:trHeight w:val="355"/>
         </w:trPr>
@@ -130,7 +130,7 @@
               <w:right w:val="single" w:sz="3" w:space="0" w:color="000000"/>
             </w:tcBorders>
           </w:tcPr>
-          <w:p>
+          <w:p ns2:paraId="17E97315" ns2:textId="77777777">
             <w:pPr>
               <w:spacing w:after="0" w:line="259" w:lineRule="auto"/>
               <w:ind w:left="0" w:firstLine="0"/>
@@ -154,7 +154,7 @@
               <w:right w:val="single" w:sz="3" w:space="0" w:color="000000"/>
             </w:tcBorders>
           </w:tcPr>
-          <w:p>
+          <w:p ns2:paraId="71F0B262" ns2:textId="77777777">
             <w:pPr>
               <w:spacing w:after="0" w:line="259" w:lineRule="auto"/>
               <w:ind w:left="0" w:firstLine="0"/>
@@ -178,7 +178,7 @@
               <w:right w:val="single" w:sz="3" w:space="0" w:color="000000"/>
             </w:tcBorders>
           </w:tcPr>
-          <w:p>
+          <w:p ns2:paraId="39F85DED" ns2:textId="77777777">
             <w:pPr>
               <w:spacing w:after="0" w:line="259" w:lineRule="auto"/>
               <w:ind w:left="0" w:firstLine="0"/>
@@ -202,7 +202,7 @@
               <w:right w:val="single" w:sz="3" w:space="0" w:color="000000"/>
             </w:tcBorders>
           </w:tcPr>
-          <w:p>
+          <w:p ns2:paraId="08381E8C" ns2:textId="77777777">
             <w:pPr>
               <w:spacing w:after="0" w:line="259" w:lineRule="auto"/>
               <w:ind w:left="0" w:firstLine="0"/>
@@ -217,7 +217,7 @@
           </w:p>
         </w:tc>
       </w:tr>
-      <w:tr>
+      <w:tr ns2:paraId="3DDA1496" ns2:textId="77777777">
         <w:trPr>
           <w:trHeight w:val="1741"/>
         </w:trPr>
@@ -231,7 +231,7 @@
               <w:right w:val="single" w:sz="3" w:space="0" w:color="000000"/>
             </w:tcBorders>
           </w:tcPr>
-          <w:p>
+          <w:p ns2:paraId="3CEBFB8F" ns2:textId="77777777">
             <w:pPr>
               <w:spacing w:after="0" w:line="259" w:lineRule="auto"/>
               <w:ind w:left="0" w:firstLine="0"/>
@@ -252,7 +252,7 @@
               <w:right w:val="single" w:sz="3" w:space="0" w:color="000000"/>
             </w:tcBorders>
           </w:tcPr>
-          <w:p>
+          <w:p ns2:paraId="441E67A7" ns2:textId="77777777">
             <w:pPr>
               <w:spacing w:after="0" w:line="259" w:lineRule="auto"/>
               <w:ind w:left="0" w:firstLine="0"/>
@@ -272,7 +272,7 @@
               <w:right w:val="single" w:sz="3" w:space="0" w:color="000000"/>
             </w:tcBorders>
           </w:tcPr>
-          <w:p>
+          <w:p ns2:paraId="5D7B4F2D" ns2:textId="77777777">
             <w:pPr>
               <w:spacing w:after="0" w:line="259" w:lineRule="auto"/>
               <w:ind w:left="0" w:firstLine="0"/>
@@ -292,7 +292,7 @@
               <w:right w:val="single" w:sz="3" w:space="0" w:color="000000"/>
             </w:tcBorders>
           </w:tcPr>
-          <w:p>
+          <w:p ns2:paraId="5E99658F" ns2:textId="77777777">
             <w:pPr>
               <w:spacing w:after="0" w:line="259" w:lineRule="auto"/>
               <w:ind w:left="0" w:firstLine="0"/>
@@ -303,7 +303,7 @@
           </w:p>
         </w:tc>
       </w:tr>
-      <w:tr>
+      <w:tr ns2:paraId="374F8673" ns2:textId="77777777">
         <w:trPr>
           <w:trHeight w:val="1741"/>
         </w:trPr>
@@ -317,7 +317,7 @@
               <w:right w:val="single" w:sz="3" w:space="0" w:color="000000"/>
             </w:tcBorders>
           </w:tcPr>
-          <w:p>
+          <w:p ns2:paraId="72549F12" ns2:textId="77777777">
             <w:pPr>
               <w:spacing w:after="0" w:line="259" w:lineRule="auto"/>
               <w:ind w:left="0" w:firstLine="0"/>
@@ -338,7 +338,7 @@
               <w:right w:val="single" w:sz="3" w:space="0" w:color="000000"/>
             </w:tcBorders>
           </w:tcPr>
-          <w:p>
+          <w:p ns2:paraId="33677AEA" ns2:textId="77777777">
             <w:pPr>
               <w:spacing w:after="0" w:line="295" w:lineRule="auto"/>
               <w:ind w:left="0" w:firstLine="0"/>
@@ -347,7 +347,7 @@
               <w:t>Turtle Ship Model / Yi Sun-sin Naval Ar-</w:t>
             </w:r>
           </w:p>
-          <w:p>
+          <w:p ns2:paraId="23E322C6" ns2:textId="77777777">
             <w:pPr>
               <w:spacing w:after="0" w:line="259" w:lineRule="auto"/>
               <w:ind w:left="0" w:firstLine="0"/>
@@ -368,7 +368,7 @@
               <w:right w:val="single" w:sz="3" w:space="0" w:color="000000"/>
             </w:tcBorders>
           </w:tcPr>
-          <w:p>
+          <w:p ns2:paraId="5BB9CF82" ns2:textId="77777777">
             <w:pPr>
               <w:spacing w:after="42" w:line="259" w:lineRule="auto"/>
               <w:ind w:left="0" w:firstLine="0"/>
@@ -378,7 +378,7 @@
               <w:t>National Museum of</w:t>
             </w:r>
           </w:p>
-          <w:p>
+          <w:p ns2:paraId="025A964E" ns2:textId="77777777">
             <w:pPr>
               <w:spacing w:after="0" w:line="259" w:lineRule="auto"/>
               <w:ind w:left="0" w:firstLine="0"/>
@@ -399,7 +399,7 @@
               <w:right w:val="single" w:sz="3" w:space="0" w:color="000000"/>
             </w:tcBorders>
           </w:tcPr>
-          <w:p>
+          <w:p ns2:paraId="6844ED46" ns2:textId="77777777">
             <w:pPr>
               <w:spacing w:after="0" w:line="259" w:lineRule="auto"/>
               <w:ind w:left="0" w:firstLine="0"/>
@@ -410,7 +410,7 @@
           </w:p>
         </w:tc>
       </w:tr>
-      <w:tr>
+      <w:tr ns2:paraId="2F7D8743" ns2:textId="77777777">
         <w:trPr>
           <w:trHeight w:val="1395"/>
         </w:trPr>
@@ -424,7 +424,7 @@
               <w:right w:val="single" w:sz="3" w:space="0" w:color="000000"/>
             </w:tcBorders>
           </w:tcPr>
-          <w:p>
+          <w:p ns2:paraId="00E5C977" ns2:textId="77777777">
             <w:pPr>
               <w:spacing w:after="0" w:line="259" w:lineRule="auto"/>
               <w:ind w:left="0" w:firstLine="0"/>
@@ -445,7 +445,7 @@
               <w:right w:val="single" w:sz="3" w:space="0" w:color="000000"/>
             </w:tcBorders>
           </w:tcPr>
-          <w:p>
+          <w:p ns2:paraId="0A6E8BFD" ns2:textId="77777777">
             <w:pPr>
               <w:spacing w:after="42" w:line="259" w:lineRule="auto"/>
               <w:ind w:left="0" w:firstLine="0"/>
@@ -455,7 +455,7 @@
               <w:t>Edo Period Samurai</w:t>
             </w:r>
           </w:p>
-          <w:p>
+          <w:p ns2:paraId="4DFD0D67" ns2:textId="77777777">
             <w:pPr>
               <w:spacing w:after="0" w:line="259" w:lineRule="auto"/>
               <w:ind w:left="0" w:firstLine="0"/>
@@ -476,7 +476,7 @@
               <w:right w:val="single" w:sz="3" w:space="0" w:color="000000"/>
             </w:tcBorders>
           </w:tcPr>
-          <w:p>
+          <w:p ns2:paraId="7FF7F900" ns2:textId="77777777">
             <w:pPr>
               <w:spacing w:after="0" w:line="259" w:lineRule="auto"/>
               <w:ind w:left="0" w:firstLine="0"/>
@@ -497,7 +497,7 @@
               <w:right w:val="single" w:sz="3" w:space="0" w:color="000000"/>
             </w:tcBorders>
           </w:tcPr>
-          <w:p>
+          <w:p ns2:paraId="67186F95" ns2:textId="77777777">
             <w:pPr>
               <w:spacing w:after="0" w:line="259" w:lineRule="auto"/>
               <w:ind w:left="0" w:firstLine="0"/>
@@ -509,7 +509,7 @@
         </w:tc>
       </w:tr>
     </w:tbl>
-    <w:p>
+    <w:p ns2:paraId="7DBAF0E6" ns2:textId="77777777">
       <w:pPr>
         <w:pStyle w:val="1"/>
         <w:ind w:left="-5"/>
@@ -538,7 +538,7 @@
         <w:gridCol w:w="2231"/>
         <w:gridCol w:w="2231"/>
       </w:tblGrid>
-      <w:tr>
+      <w:tr ns2:paraId="4ED17DB7" ns2:textId="77777777">
         <w:trPr>
           <w:trHeight w:val="355"/>
         </w:trPr>
@@ -552,7 +552,7 @@
               <w:right w:val="single" w:sz="3" w:space="0" w:color="000000"/>
             </w:tcBorders>
           </w:tcPr>
-          <w:p>
+          <w:p ns2:paraId="07B8A669" ns2:textId="77777777">
             <w:pPr>
               <w:spacing w:after="0" w:line="259" w:lineRule="auto"/>
               <w:ind w:left="0" w:firstLine="0"/>
@@ -576,7 +576,7 @@
               <w:right w:val="single" w:sz="3" w:space="0" w:color="000000"/>
             </w:tcBorders>
           </w:tcPr>
-          <w:p>
+          <w:p ns2:paraId="51D4D18D" ns2:textId="77777777">
             <w:pPr>
               <w:spacing w:after="0" w:line="259" w:lineRule="auto"/>
               <w:ind w:left="0" w:firstLine="0"/>
@@ -600,7 +600,7 @@
               <w:right w:val="single" w:sz="3" w:space="0" w:color="000000"/>
             </w:tcBorders>
           </w:tcPr>
-          <w:p>
+          <w:p ns2:paraId="6C77EC08" ns2:textId="77777777">
             <w:pPr>
               <w:spacing w:after="0" w:line="259" w:lineRule="auto"/>
               <w:ind w:left="0" w:firstLine="0"/>
@@ -624,7 +624,7 @@
               <w:right w:val="single" w:sz="3" w:space="0" w:color="000000"/>
             </w:tcBorders>
           </w:tcPr>
-          <w:p>
+          <w:p ns2:paraId="4FA6D8A1" ns2:textId="77777777">
             <w:pPr>
               <w:spacing w:after="0" w:line="259" w:lineRule="auto"/>
               <w:ind w:left="0" w:firstLine="0"/>
@@ -639,7 +639,7 @@
           </w:p>
         </w:tc>
       </w:tr>
-      <w:tr>
+      <w:tr ns2:paraId="2B08368D" ns2:textId="77777777">
         <w:trPr>
           <w:trHeight w:val="355"/>
         </w:trPr>
@@ -653,7 +653,7 @@
               <w:right w:val="single" w:sz="3" w:space="0" w:color="000000"/>
             </w:tcBorders>
           </w:tcPr>
-          <w:p>
+          <w:p ns2:paraId="55D0BE87" ns2:textId="77777777">
             <w:pPr>
               <w:spacing w:after="0" w:line="259" w:lineRule="auto"/>
               <w:ind w:left="0" w:firstLine="0"/>
@@ -674,7 +674,7 @@
               <w:right w:val="single" w:sz="3" w:space="0" w:color="000000"/>
             </w:tcBorders>
           </w:tcPr>
-          <w:p>
+          <w:p ns2:paraId="442A3435" ns2:textId="77777777">
             <w:pPr>
               <w:spacing w:after="0" w:line="259" w:lineRule="auto"/>
               <w:ind w:left="0" w:firstLine="0"/>
@@ -695,7 +695,7 @@
               <w:right w:val="single" w:sz="3" w:space="0" w:color="000000"/>
             </w:tcBorders>
           </w:tcPr>
-          <w:p>
+          <w:p ns2:paraId="2221B610" ns2:textId="77777777">
             <w:pPr>
               <w:spacing w:after="0" w:line="259" w:lineRule="auto"/>
               <w:ind w:left="0" w:firstLine="0"/>
@@ -716,7 +716,7 @@
               <w:right w:val="single" w:sz="3" w:space="0" w:color="000000"/>
             </w:tcBorders>
           </w:tcPr>
-          <w:p>
+          <w:p ns2:paraId="0252515E" ns2:textId="77777777">
             <w:pPr>
               <w:spacing w:after="0" w:line="259" w:lineRule="auto"/>
               <w:ind w:left="0" w:firstLine="0"/>
@@ -728,7 +728,7 @@
           </w:p>
         </w:tc>
       </w:tr>
-      <w:tr>
+      <w:tr ns2:paraId="17385C5E" ns2:textId="77777777">
         <w:trPr>
           <w:trHeight w:val="701"/>
         </w:trPr>
@@ -742,7 +742,7 @@
               <w:right w:val="single" w:sz="3" w:space="0" w:color="000000"/>
             </w:tcBorders>
           </w:tcPr>
-          <w:p>
+          <w:p ns2:paraId="752189ED" ns2:textId="77777777">
             <w:pPr>
               <w:spacing w:after="0" w:line="259" w:lineRule="auto"/>
               <w:ind w:left="0" w:firstLine="0"/>
@@ -763,7 +763,7 @@
               <w:right w:val="single" w:sz="3" w:space="0" w:color="000000"/>
             </w:tcBorders>
           </w:tcPr>
-          <w:p>
+          <w:p ns2:paraId="22B53D9D" ns2:textId="77777777">
             <w:pPr>
               <w:spacing w:after="0" w:line="259" w:lineRule="auto"/>
               <w:ind w:left="0" w:firstLine="0"/>
@@ -784,7 +784,7 @@
               <w:right w:val="single" w:sz="3" w:space="0" w:color="000000"/>
             </w:tcBorders>
           </w:tcPr>
-          <w:p>
+          <w:p ns2:paraId="1E0974E6" ns2:textId="77777777">
             <w:pPr>
               <w:spacing w:after="0" w:line="259" w:lineRule="auto"/>
               <w:ind w:left="0" w:firstLine="0"/>
@@ -805,7 +805,7 @@
               <w:right w:val="single" w:sz="3" w:space="0" w:color="000000"/>
             </w:tcBorders>
           </w:tcPr>
-          <w:p>
+          <w:p ns2:paraId="6BD64C41" ns2:textId="77777777">
             <w:pPr>
               <w:spacing w:after="0" w:line="259" w:lineRule="auto"/>
               <w:ind w:left="0" w:firstLine="0"/>
@@ -817,7 +817,7 @@
           </w:p>
         </w:tc>
       </w:tr>
-      <w:tr>
+      <w:tr ns2:paraId="7D633A75" ns2:textId="77777777">
         <w:trPr>
           <w:trHeight w:val="701"/>
         </w:trPr>
@@ -831,7 +831,7 @@
               <w:right w:val="single" w:sz="3" w:space="0" w:color="000000"/>
             </w:tcBorders>
           </w:tcPr>
-          <w:p>
+          <w:p ns2:paraId="683C3446" ns2:textId="77777777">
             <w:pPr>
               <w:spacing w:after="0" w:line="259" w:lineRule="auto"/>
               <w:ind w:left="0" w:firstLine="0"/>
@@ -852,7 +852,7 @@
               <w:right w:val="single" w:sz="3" w:space="0" w:color="000000"/>
             </w:tcBorders>
           </w:tcPr>
-          <w:p>
+          <w:p ns2:paraId="68AE4F1F" ns2:textId="77777777">
             <w:pPr>
               <w:spacing w:after="0" w:line="259" w:lineRule="auto"/>
               <w:ind w:left="0" w:firstLine="0"/>
@@ -873,7 +873,7 @@
               <w:right w:val="single" w:sz="3" w:space="0" w:color="000000"/>
             </w:tcBorders>
           </w:tcPr>
-          <w:p>
+          <w:p ns2:paraId="021E5579" ns2:textId="77777777">
             <w:pPr>
               <w:tabs>
                 <w:tab w:val="center" w:pos="1178"/>
@@ -895,7 +895,7 @@
               <w:t>sur-</w:t>
             </w:r>
           </w:p>
-          <w:p>
+          <w:p ns2:paraId="60C1A413" ns2:textId="77777777">
             <w:pPr>
               <w:spacing w:after="0" w:line="259" w:lineRule="auto"/>
               <w:ind w:left="0" w:firstLine="0"/>
@@ -916,7 +916,7 @@
               <w:right w:val="single" w:sz="3" w:space="0" w:color="000000"/>
             </w:tcBorders>
           </w:tcPr>
-          <w:p>
+          <w:p ns2:paraId="7FC051AE" ns2:textId="77777777">
             <w:pPr>
               <w:spacing w:after="42" w:line="259" w:lineRule="auto"/>
               <w:ind w:left="0" w:firstLine="0"/>
@@ -926,7 +926,7 @@
               <w:t>Bushido and aes-</w:t>
             </w:r>
           </w:p>
-          <w:p>
+          <w:p ns2:paraId="100A7CD2" ns2:textId="77777777">
             <w:pPr>
               <w:spacing w:after="0" w:line="259" w:lineRule="auto"/>
               <w:ind w:left="0" w:firstLine="0"/>
@@ -938,7 +938,7 @@
           </w:p>
         </w:tc>
       </w:tr>
-      <w:tr>
+      <w:tr ns2:paraId="6960429D" ns2:textId="77777777">
         <w:trPr>
           <w:trHeight w:val="701"/>
         </w:trPr>
@@ -952,7 +952,7 @@
               <w:right w:val="single" w:sz="3" w:space="0" w:color="000000"/>
             </w:tcBorders>
           </w:tcPr>
-          <w:p>
+          <w:p ns2:paraId="62C6A738" ns2:textId="77777777">
             <w:pPr>
               <w:spacing w:after="0" w:line="259" w:lineRule="auto"/>
               <w:ind w:left="0" w:firstLine="0"/>
@@ -973,7 +973,7 @@
               <w:right w:val="single" w:sz="3" w:space="0" w:color="000000"/>
             </w:tcBorders>
           </w:tcPr>
-          <w:p>
+          <w:p ns2:paraId="7A09EDFA" ns2:textId="77777777">
             <w:pPr>
               <w:spacing w:after="0" w:line="259" w:lineRule="auto"/>
               <w:ind w:left="0" w:firstLine="0"/>
@@ -994,7 +994,7 @@
               <w:right w:val="single" w:sz="3" w:space="0" w:color="000000"/>
             </w:tcBorders>
           </w:tcPr>
-          <w:p>
+          <w:p ns2:paraId="69FB7978" ns2:textId="77777777">
             <w:pPr>
               <w:spacing w:after="42" w:line="259" w:lineRule="auto"/>
               <w:ind w:left="0" w:firstLine="0"/>
@@ -1004,7 +1004,7 @@
               <w:t>Defensive and sym-</w:t>
             </w:r>
           </w:p>
-          <w:p>
+          <w:p ns2:paraId="6F6FCEED" ns2:textId="77777777">
             <w:pPr>
               <w:spacing w:after="0" w:line="259" w:lineRule="auto"/>
               <w:ind w:left="0" w:firstLine="0"/>
@@ -1025,7 +1025,7 @@
               <w:right w:val="single" w:sz="3" w:space="0" w:color="000000"/>
             </w:tcBorders>
           </w:tcPr>
-          <w:p>
+          <w:p ns2:paraId="2F624E3D" ns2:textId="77777777">
             <w:pPr>
               <w:spacing w:after="0" w:line="259" w:lineRule="auto"/>
               <w:ind w:left="0" w:firstLine="0"/>
@@ -1037,7 +1037,7 @@
           </w:p>
         </w:tc>
       </w:tr>
-      <w:tr>
+      <w:tr ns2:paraId="248D16B6" ns2:textId="77777777">
         <w:trPr>
           <w:trHeight w:val="701"/>
         </w:trPr>
@@ -1051,7 +1051,7 @@
               <w:right w:val="single" w:sz="3" w:space="0" w:color="000000"/>
             </w:tcBorders>
           </w:tcPr>
-          <w:p>
+          <w:p ns2:paraId="2CE873AD" ns2:textId="77777777">
             <w:pPr>
               <w:spacing w:after="0" w:line="259" w:lineRule="auto"/>
               <w:ind w:left="0" w:firstLine="0"/>
@@ -1076,7 +1076,7 @@
               <w:right w:val="single" w:sz="3" w:space="0" w:color="000000"/>
             </w:tcBorders>
           </w:tcPr>
-          <w:p>
+          <w:p ns2:paraId="6CAA8A3D" ns2:textId="77777777">
             <w:pPr>
               <w:spacing w:after="0" w:line="259" w:lineRule="auto"/>
               <w:ind w:left="0" w:firstLine="0"/>
@@ -1097,7 +1097,7 @@
               <w:right w:val="single" w:sz="3" w:space="0" w:color="000000"/>
             </w:tcBorders>
           </w:tcPr>
-          <w:p>
+          <w:p ns2:paraId="6586308E" ns2:textId="77777777">
             <w:pPr>
               <w:spacing w:after="0" w:line="259" w:lineRule="auto"/>
               <w:ind w:left="0" w:firstLine="0"/>
@@ -1118,7 +1118,7 @@
               <w:right w:val="single" w:sz="3" w:space="0" w:color="000000"/>
             </w:tcBorders>
           </w:tcPr>
-          <w:p>
+          <w:p ns2:paraId="6801B517" ns2:textId="77777777">
             <w:pPr>
               <w:spacing w:after="0" w:line="259" w:lineRule="auto"/>
               <w:ind w:left="0" w:firstLine="0"/>
@@ -1131,7 +1131,7 @@
         </w:tc>
       </w:tr>
     </w:tbl>
-    <w:p>
+    <w:p ns2:paraId="53AD1869" ns2:textId="77777777">
       <w:pPr>
         <w:pStyle w:val="1"/>
         <w:spacing w:after="277"/>
@@ -1141,7 +1141,7 @@
         <w:t>Project Outline</w:t>
       </w:r>
     </w:p>
-    <w:p>
+    <w:p ns2:paraId="328E5B3F" ns2:textId="77777777">
       <w:pPr>
         <w:pStyle w:val="2"/>
         <w:spacing w:after="193"/>
@@ -1151,7 +1151,7 @@
         <w:t>1. Introduction (200–250 words)</w:t>
       </w:r>
     </w:p>
-    <w:p>
+    <w:p ns2:paraId="1A4F5755" ns2:textId="77777777">
       <w:pPr>
         <w:numPr>
           <w:ilvl w:val="0"/>
@@ -1163,7 +1163,7 @@
         <w:t>Introduce East Asia as an interconnected civilization.</w:t>
       </w:r>
     </w:p>
-    <w:p>
+    <w:p ns2:paraId="70D60A61" ns2:textId="77777777">
       <w:pPr>
         <w:numPr>
           <w:ilvl w:val="0"/>
@@ -1175,7 +1175,7 @@
         <w:t>Explain how war connected China, Korea, and Japan.</w:t>
       </w:r>
     </w:p>
-    <w:p>
+    <w:p ns2:paraId="5E591569" ns2:textId="77777777">
       <w:pPr>
         <w:numPr>
           <w:ilvl w:val="0"/>
@@ -1187,7 +1187,7 @@
         <w:t>Introduce the three selected objects.</w:t>
       </w:r>
     </w:p>
-    <w:p>
+    <w:p ns2:paraId="1A9745D2" ns2:textId="77777777">
       <w:pPr>
         <w:numPr>
           <w:ilvl w:val="0"/>
@@ -1200,7 +1200,7 @@
         <w:t>Present the central comparative argument.</w:t>
       </w:r>
     </w:p>
-    <w:p>
+    <w:p ns2:paraId="385E599D" ns2:textId="77777777">
       <w:pPr>
         <w:pStyle w:val="2"/>
         <w:ind w:left="-5"/>
@@ -1209,7 +1209,7 @@
         <w:t>2. China Object Analysis (100–150 words)</w:t>
       </w:r>
     </w:p>
-    <w:p>
+    <w:p ns2:paraId="16A0AB16" ns2:textId="77777777">
       <w:pPr>
         <w:pStyle w:val="3"/>
         <w:ind w:left="-5"/>
@@ -1218,7 +1218,7 @@
         <w:t>Object: Ming Dynasty Brigandine Armor</w:t>
       </w:r>
     </w:p>
-    <w:p>
+    <w:p ns2:paraId="2CD036AC" ns2:textId="77777777">
       <w:pPr>
         <w:numPr>
           <w:ilvl w:val="0"/>
@@ -1230,7 +1230,7 @@
         <w:t>Describe the armor and its materials.</w:t>
       </w:r>
     </w:p>
-    <w:p>
+    <w:p ns2:paraId="4ACE297E" ns2:textId="77777777">
       <w:pPr>
         <w:numPr>
           <w:ilvl w:val="0"/>
@@ -1242,7 +1242,7 @@
         <w:t>Explain Ming military organization.</w:t>
       </w:r>
     </w:p>
-    <w:p>
+    <w:p ns2:paraId="621AABC6" ns2:textId="77777777">
       <w:pPr>
         <w:numPr>
           <w:ilvl w:val="0"/>
@@ -1254,7 +1254,7 @@
         <w:t>Discuss practicality and centralized warfare.</w:t>
       </w:r>
     </w:p>
-    <w:p>
+    <w:p ns2:paraId="343CC570" ns2:textId="77777777">
       <w:pPr>
         <w:numPr>
           <w:ilvl w:val="0"/>
@@ -1268,6 +1268,11 @@
       </w:r>
     </w:p>
     <w:p>
+      <w:r>
+        <w:t xml:space="preserve">The Ming Dynasty brigandine armor in the Metropolitan Museum is made from rows of small iron or steel plates riveted beneath a fabric or leather outer layer, giving soldiers both mobility and strong protection. Its standardized construction reflects the Ming state's centralized military system, in which large garrisons and hereditary military households were equipped through government-controlled supply networks. The armor emphasizes durability and battlefield function rather than individual display, matching the Ming goal of maintaining internal order and defending imperial frontiers. Compared with Edo samurai armor, which often highlighted clan symbols and personal status, Ming brigandine armor represents a bureaucratic model of warfare: disciplined, collective, and closely tied to Confucian ideas of state authority.</w:t>
+      </w:r>
+    </w:p>
+    <w:p ns2:paraId="1A6F32DB" ns2:textId="77777777">
       <w:pPr>
         <w:pStyle w:val="2"/>
         <w:ind w:left="-5"/>
@@ -1277,7 +1282,7 @@
         <w:t>3. Korea Object Analysis (100–150 words)</w:t>
       </w:r>
     </w:p>
-    <w:p>
+    <w:p ns2:paraId="36FEB4E1" ns2:textId="77777777">
       <w:pPr>
         <w:pStyle w:val="3"/>
         <w:ind w:left="-5"/>
@@ -1286,7 +1291,7 @@
         <w:t>Object: Turtle Ship</w:t>
       </w:r>
     </w:p>
-    <w:p>
+    <w:p ns2:paraId="646DF3DA" ns2:textId="77777777">
       <w:pPr>
         <w:numPr>
           <w:ilvl w:val="0"/>
@@ -1298,7 +1303,7 @@
         <w:t>Describe the turtle ship and naval technology.</w:t>
       </w:r>
     </w:p>
-    <w:p>
+    <w:p ns2:paraId="6930E369" ns2:textId="77777777">
       <w:pPr>
         <w:numPr>
           <w:ilvl w:val="0"/>
@@ -1310,7 +1315,7 @@
         <w:t>Explain the Imjin War historical context.</w:t>
       </w:r>
     </w:p>
-    <w:p>
+    <w:p ns2:paraId="13911E98" ns2:textId="77777777">
       <w:pPr>
         <w:numPr>
           <w:ilvl w:val="0"/>
@@ -1322,7 +1327,7 @@
         <w:t>Discuss defense and national survival.</w:t>
       </w:r>
     </w:p>
-    <w:p>
+    <w:p ns2:paraId="414F72D4" ns2:textId="77777777">
       <w:pPr>
         <w:numPr>
           <w:ilvl w:val="0"/>
@@ -1335,7 +1340,7 @@
         <w:t>Connect the object to East Asian military interaction.</w:t>
       </w:r>
     </w:p>
-    <w:p>
+    <w:p ns2:paraId="1FF4FF0B" ns2:textId="77777777">
       <w:pPr>
         <w:pStyle w:val="2"/>
         <w:ind w:left="-5"/>
@@ -1344,7 +1349,7 @@
         <w:t>4. Japan Object Analysis (100–150 words)</w:t>
       </w:r>
     </w:p>
-    <w:p>
+    <w:p ns2:paraId="14E8FC2D" ns2:textId="77777777">
       <w:pPr>
         <w:pStyle w:val="3"/>
         <w:ind w:left="-5"/>
@@ -1353,7 +1358,7 @@
         <w:t>Object: Edo Samurai Armor</w:t>
       </w:r>
     </w:p>
-    <w:p>
+    <w:p ns2:paraId="491F0025" ns2:textId="77777777">
       <w:pPr>
         <w:numPr>
           <w:ilvl w:val="0"/>
@@ -1365,7 +1370,7 @@
         <w:t>Describe the armor’s appearance and decoration.</w:t>
       </w:r>
     </w:p>
-    <w:p>
+    <w:p ns2:paraId="45557551" ns2:textId="77777777">
       <w:pPr>
         <w:numPr>
           <w:ilvl w:val="0"/>
@@ -1377,7 +1382,7 @@
         <w:t>Explain Bushido and samurai identity.</w:t>
       </w:r>
     </w:p>
-    <w:p>
+    <w:p ns2:paraId="7A827126" ns2:textId="77777777">
       <w:pPr>
         <w:numPr>
           <w:ilvl w:val="0"/>
@@ -1389,7 +1394,7 @@
         <w:t>Discuss warrior aesthetics and feudal society.</w:t>
       </w:r>
     </w:p>
-    <w:p>
+    <w:p ns2:paraId="793BBF01" ns2:textId="77777777">
       <w:pPr>
         <w:numPr>
           <w:ilvl w:val="0"/>
@@ -1402,7 +1407,7 @@
         <w:t>Compare with Ming military practicality.</w:t>
       </w:r>
     </w:p>
-    <w:p>
+    <w:p ns2:paraId="041B817A" ns2:textId="77777777">
       <w:pPr>
         <w:pStyle w:val="2"/>
         <w:spacing w:after="193"/>
@@ -1412,7 +1417,7 @@
         <w:t>5. Conclusion (150–200 words)</w:t>
       </w:r>
     </w:p>
-    <w:p>
+    <w:p ns2:paraId="2E42DF64" ns2:textId="77777777">
       <w:pPr>
         <w:numPr>
           <w:ilvl w:val="0"/>
@@ -1424,7 +1429,7 @@
         <w:t>Summarize the similarities and differences.</w:t>
       </w:r>
     </w:p>
-    <w:p>
+    <w:p ns2:paraId="5680D066" ns2:textId="77777777">
       <w:pPr>
         <w:numPr>
           <w:ilvl w:val="0"/>
@@ -1436,7 +1441,7 @@
         <w:t>Explain how material objects reveal cultural values.</w:t>
       </w:r>
     </w:p>
-    <w:p>
+    <w:p ns2:paraId="26C7C76D" ns2:textId="77777777">
       <w:pPr>
         <w:numPr>
           <w:ilvl w:val="0"/>
@@ -1448,7 +1453,7 @@
         <w:t>Connect the project to East Asian interaction and exchange.</w:t>
       </w:r>
     </w:p>
-    <w:p>
+    <w:p ns2:paraId="593A696D" ns2:textId="77777777">
       <w:pPr>
         <w:numPr>
           <w:ilvl w:val="0"/>
@@ -1460,7 +1465,7 @@
         <w:t>Conclude that East Asia was both connected and internally diverse.</w:t>
       </w:r>
     </w:p>
-    <w:p>
+    <w:p ns2:paraId="30EB69B8" ns2:textId="77777777">
       <w:pPr>
         <w:pStyle w:val="1"/>
         <w:ind w:left="-5"/>
@@ -1487,7 +1492,7 @@
         <w:gridCol w:w="3082"/>
         <w:gridCol w:w="3649"/>
       </w:tblGrid>
-      <w:tr>
+      <w:tr ns2:paraId="5FDC3AEE" ns2:textId="77777777">
         <w:trPr>
           <w:trHeight w:val="355"/>
         </w:trPr>
@@ -1501,7 +1506,7 @@
               <w:right w:val="single" w:sz="3" w:space="0" w:color="000000"/>
             </w:tcBorders>
           </w:tcPr>
-          <w:p>
+          <w:p ns2:paraId="524379A1" ns2:textId="77777777">
             <w:pPr>
               <w:spacing w:after="0" w:line="259" w:lineRule="auto"/>
               <w:ind w:left="0" w:firstLine="0"/>
@@ -1525,7 +1530,7 @@
               <w:right w:val="single" w:sz="3" w:space="0" w:color="000000"/>
             </w:tcBorders>
           </w:tcPr>
-          <w:p>
+          <w:p ns2:paraId="019E01C4" ns2:textId="77777777">
             <w:pPr>
               <w:spacing w:after="0" w:line="259" w:lineRule="auto"/>
               <w:ind w:left="0" w:firstLine="0"/>
@@ -1549,7 +1554,7 @@
               <w:right w:val="single" w:sz="3" w:space="0" w:color="000000"/>
             </w:tcBorders>
           </w:tcPr>
-          <w:p>
+          <w:p ns2:paraId="25B65B60" ns2:textId="77777777">
             <w:pPr>
               <w:spacing w:after="0" w:line="259" w:lineRule="auto"/>
               <w:ind w:left="0" w:firstLine="0"/>
@@ -1564,7 +1569,7 @@
           </w:p>
         </w:tc>
       </w:tr>
-      <w:tr>
+      <w:tr ns2:paraId="2F9AE16C" ns2:textId="77777777">
         <w:trPr>
           <w:trHeight w:val="1395"/>
         </w:trPr>
@@ -1578,7 +1583,7 @@
               <w:right w:val="single" w:sz="3" w:space="0" w:color="000000"/>
             </w:tcBorders>
           </w:tcPr>
-          <w:p>
+          <w:p ns2:paraId="1ECDA5A0" ns2:textId="77777777">
             <w:pPr>
               <w:spacing w:after="0" w:line="259" w:lineRule="auto"/>
               <w:ind w:left="0" w:firstLine="0"/>
@@ -1600,7 +1605,7 @@
               <w:right w:val="single" w:sz="3" w:space="0" w:color="000000"/>
             </w:tcBorders>
           </w:tcPr>
-          <w:p>
+          <w:p ns2:paraId="5257AF29" ns2:textId="77777777">
             <w:pPr>
               <w:tabs>
                 <w:tab w:val="center" w:pos="1687"/>
@@ -1622,7 +1627,7 @@
               <w:t>Overall</w:t>
             </w:r>
           </w:p>
-          <w:p>
+          <w:p ns2:paraId="08E78F0A" ns2:textId="77777777">
             <w:pPr>
               <w:spacing w:after="0" w:line="259" w:lineRule="auto"/>
               <w:ind w:left="0" w:firstLine="0"/>
@@ -1643,7 +1648,7 @@
               <w:right w:val="single" w:sz="3" w:space="0" w:color="000000"/>
             </w:tcBorders>
           </w:tcPr>
-          <w:p>
+          <w:p ns2:paraId="36672FA0" ns2:textId="77777777">
             <w:pPr>
               <w:spacing w:after="0" w:line="259" w:lineRule="auto"/>
               <w:ind w:left="0" w:firstLine="0"/>
@@ -1654,7 +1659,7 @@
           </w:p>
         </w:tc>
       </w:tr>
-      <w:tr>
+      <w:tr ns2:paraId="6899FE0B" ns2:textId="77777777">
         <w:trPr>
           <w:trHeight w:val="1048"/>
         </w:trPr>
@@ -1668,7 +1673,7 @@
               <w:right w:val="single" w:sz="3" w:space="0" w:color="000000"/>
             </w:tcBorders>
           </w:tcPr>
-          <w:p>
+          <w:p ns2:paraId="63C6ACF8" ns2:textId="77777777">
             <w:pPr>
               <w:spacing w:after="0" w:line="259" w:lineRule="auto"/>
               <w:ind w:left="0" w:firstLine="0"/>
@@ -1689,7 +1694,7 @@
               <w:right w:val="single" w:sz="3" w:space="0" w:color="000000"/>
             </w:tcBorders>
           </w:tcPr>
-          <w:p>
+          <w:p ns2:paraId="57E6A3E6" ns2:textId="77777777">
             <w:pPr>
               <w:spacing w:after="0" w:line="259" w:lineRule="auto"/>
               <w:ind w:left="0" w:firstLine="0"/>
@@ -1710,7 +1715,7 @@
               <w:right w:val="single" w:sz="3" w:space="0" w:color="000000"/>
             </w:tcBorders>
           </w:tcPr>
-          <w:p>
+          <w:p ns2:paraId="462A876B" ns2:textId="77777777">
             <w:pPr>
               <w:spacing w:after="0" w:line="259" w:lineRule="auto"/>
               <w:ind w:left="0" w:firstLine="0"/>
@@ -1721,7 +1726,7 @@
           </w:p>
         </w:tc>
       </w:tr>
-      <w:tr>
+      <w:tr ns2:paraId="3B5DE0AC" ns2:textId="77777777">
         <w:trPr>
           <w:trHeight w:val="1395"/>
         </w:trPr>
@@ -1735,7 +1740,7 @@
               <w:right w:val="single" w:sz="3" w:space="0" w:color="000000"/>
             </w:tcBorders>
           </w:tcPr>
-          <w:p>
+          <w:p ns2:paraId="76B3D498" ns2:textId="77777777">
             <w:pPr>
               <w:spacing w:after="0" w:line="259" w:lineRule="auto"/>
               <w:ind w:left="0" w:firstLine="0"/>
@@ -1756,7 +1761,7 @@
               <w:right w:val="single" w:sz="3" w:space="0" w:color="000000"/>
             </w:tcBorders>
           </w:tcPr>
-          <w:p>
+          <w:p ns2:paraId="6BEFBAEF" ns2:textId="77777777">
             <w:pPr>
               <w:spacing w:after="0" w:line="259" w:lineRule="auto"/>
               <w:ind w:left="0" w:firstLine="0"/>
@@ -1777,7 +1782,7 @@
               <w:right w:val="single" w:sz="3" w:space="0" w:color="000000"/>
             </w:tcBorders>
           </w:tcPr>
-          <w:p>
+          <w:p ns2:paraId="66E35C6E" ns2:textId="77777777">
             <w:pPr>
               <w:spacing w:after="0" w:line="259" w:lineRule="auto"/>
               <w:ind w:left="0" w:firstLine="0"/>
@@ -1788,7 +1793,7 @@
           </w:p>
         </w:tc>
       </w:tr>
-      <w:tr>
+      <w:tr ns2:paraId="53D39E16" ns2:textId="77777777">
         <w:trPr>
           <w:trHeight w:val="1048"/>
         </w:trPr>
@@ -1802,7 +1807,7 @@
               <w:right w:val="single" w:sz="3" w:space="0" w:color="000000"/>
             </w:tcBorders>
           </w:tcPr>
-          <w:p>
+          <w:p ns2:paraId="1B80F1DD" ns2:textId="77777777">
             <w:pPr>
               <w:spacing w:after="0" w:line="259" w:lineRule="auto"/>
               <w:ind w:left="0" w:firstLine="0"/>
@@ -1823,7 +1828,7 @@
               <w:right w:val="single" w:sz="3" w:space="0" w:color="000000"/>
             </w:tcBorders>
           </w:tcPr>
-          <w:p>
+          <w:p ns2:paraId="3CCB7AC9" ns2:textId="77777777">
             <w:pPr>
               <w:spacing w:after="0" w:line="259" w:lineRule="auto"/>
               <w:ind w:left="0" w:firstLine="0"/>
@@ -1844,7 +1849,7 @@
               <w:right w:val="single" w:sz="3" w:space="0" w:color="000000"/>
             </w:tcBorders>
           </w:tcPr>
-          <w:p>
+          <w:p ns2:paraId="65324024" ns2:textId="77777777">
             <w:pPr>
               <w:spacing w:after="0" w:line="259" w:lineRule="auto"/>
               <w:ind w:left="0" w:firstLine="0"/>
@@ -1856,7 +1861,7 @@
         </w:tc>
       </w:tr>
     </w:tbl>
-    <w:p>
+    <w:p ns2:paraId="7864993E" ns2:textId="77777777">
       <w:pPr>
         <w:pStyle w:val="1"/>
         <w:spacing w:after="202"/>
@@ -1866,7 +1871,7 @@
         <w:t>Key Themes to Emphasize</w:t>
       </w:r>
     </w:p>
-    <w:p>
+    <w:p ns2:paraId="4657C4E7" ns2:textId="77777777">
       <w:pPr>
         <w:numPr>
           <w:ilvl w:val="0"/>
@@ -1878,7 +1883,7 @@
         <w:t>Shared military exchange across East Asia</w:t>
       </w:r>
     </w:p>
-    <w:p>
+    <w:p ns2:paraId="3029A29E" ns2:textId="77777777">
       <w:pPr>
         <w:numPr>
           <w:ilvl w:val="0"/>
@@ -1890,7 +1895,7 @@
         <w:t>Different understandings of warfare</w:t>
       </w:r>
     </w:p>
-    <w:p>
+    <w:p ns2:paraId="485052ED" ns2:textId="77777777">
       <w:pPr>
         <w:numPr>
           <w:ilvl w:val="0"/>
@@ -1902,7 +1907,7 @@
         <w:t>War as cultural transmission</w:t>
       </w:r>
     </w:p>
-    <w:p>
+    <w:p ns2:paraId="4C8A2B88" ns2:textId="77777777">
       <w:pPr>
         <w:numPr>
           <w:ilvl w:val="0"/>
@@ -1914,7 +1919,7 @@
         <w:t>Confucianism vs Bushido</w:t>
       </w:r>
     </w:p>
-    <w:p>
+    <w:p ns2:paraId="6BB4EDA6" ns2:textId="77777777">
       <w:pPr>
         <w:numPr>
           <w:ilvl w:val="0"/>
@@ -1926,7 +1931,7 @@
         <w:t>Maritime Japan vs continental Korea and China</w:t>
       </w:r>
     </w:p>
-    <w:p>
+    <w:p ns2:paraId="170DF311" ns2:textId="77777777">
       <w:pPr>
         <w:numPr>
           <w:ilvl w:val="0"/>

</xml_diff>